<commit_message>
feat: Add dynamic Email/SMTP config per tenant
</commit_message>
<xml_diff>
--- a/SEAL _MARKET_RAG.docx
+++ b/SEAL _MARKET_RAG.docx
@@ -141,39 +141,18 @@
     <w:p/>
     <w:p>
       <w:r>
-        <w:t xml:space="preserve">## 5. </w:t>
-      </w:r>
-      <w:r>
-        <w:t>Sobre Nosotros y Ubicación</w:t>
-      </w:r>
-    </w:p>
-    <w:p>
-      <w:r>
-        <w:t xml:space="preserve">Somos SEAL MARKET. Operamos principalmente como un modelo de e-commerce </w:t>
-      </w:r>
-      <w:r>
-        <w:t>c</w:t>
-      </w:r>
-      <w:r>
-        <w:t>on envíos a todo México. Contamos con ubicaciones</w:t>
-      </w:r>
-      <w:r>
-        <w:t xml:space="preserve"> </w:t>
-      </w:r>
-      <w:r>
-        <w:t xml:space="preserve">físicas o almacenes en </w:t>
-      </w:r>
-      <w:r>
-        <w:t>la ciudad de Durango; Mazatlán; Guadalupe, Zac. y la ciudad de Querétaro</w:t>
-      </w:r>
-      <w:r>
-        <w:t>. Si un cliente desea pasar por su material a mostrador, sí es posible,</w:t>
-      </w:r>
-      <w:r>
-        <w:t xml:space="preserve"> </w:t>
-      </w:r>
-      <w:r>
-        <w:t>pero se debe coordinar primero el pago y la existencia.</w:t>
+        <w:t>## 5. Sobre Nosotros y Ubicación</w:t>
+      </w:r>
+    </w:p>
+    <w:p>
+      <w:r>
+        <w:t xml:space="preserve">Somos </w:t>
+      </w:r>
+      <w:r>
+        <w:t>SELLOS DEL NORTE</w:t>
+      </w:r>
+      <w:r>
+        <w:t>. Operamos principalmente como un modelo de e-commerce con envíos a todo México. Contamos con ubicaciones físicas o almacenes en la ciudad de Durango; Mazatlán; Guadalupe, Zac. y la ciudad de Querétaro. Si un cliente desea pasar por su material a mostrador, sí es posible, pero se debe coordinar primero el pago y la existencia.</w:t>
       </w:r>
     </w:p>
     <w:p/>

</xml_diff>